<commit_message>
Add website export: CSV data + stripped HTML for each figure/table
New export-website chunk in Rmd produces website/csv/ (one CSV per
figure/table with metadata headers) and website/html/ (narrative-only
HTML with figure-placeholder divs referencing CSVs). run_all.R creates
the directory structure. Also includes March 2026 data refresh.

Co-Authored-By: Claude Opus 4.6 (1M context) <noreply@anthropic.com>
</commit_message>
<xml_diff>
--- a/output/publication/methodology.docx
+++ b/output/publication/methodology.docx
@@ -23,7 +23,7 @@
         <w:pStyle w:val="Date"/>
       </w:pPr>
       <w:r>
-        <w:t xml:space="preserve">March 02, 2026</w:t>
+        <w:t xml:space="preserve">March 18, 2026</w:t>
       </w:r>
     </w:p>
     <w:bookmarkStart w:id="21" w:name="introduction"/>
@@ -1349,7 +1349,7 @@
         <w:pStyle w:val="FirstParagraph"/>
       </w:pPr>
       <w:r>
-        <w:t xml:space="preserve">Using 2024 BEA Input-Output tables, the resulting total import content shares are 32.2% for core goods and 28.2% for durables—substantially higher than the direct-only shares of 19.0% and 19.1%, respectively. The difference reflects the substantial indirect import content in goods like pharmaceuticals (18.6% direct, 55.7% total), motor vehicles (25.8% direct, 42.2% total), and personal care products (21.6% direct, 46.4% total).</w:t>
+        <w:t xml:space="preserve">Using 2024 BEA Input-Output tables, the resulting total import content shares are 32.1% for core goods and 28.0% for durables—substantially higher than the direct-only shares of 19.0% and 19.0%, respectively. The difference reflects the substantial indirect import content in goods like pharmaceuticals (18.6% direct, 55.7% total), motor vehicles (25.8% direct, 42.2% total), and personal care products (21.6% direct, 46.4% total).</w:t>
       </w:r>
     </w:p>
     <w:bookmarkEnd w:id="27"/>
@@ -1419,7 +1419,7 @@
         <w:t xml:space="preserve"> </w:t>
       </w:r>
       <w:r>
-        <w:t xml:space="preserve">is the total import content share for the relevant variant (32.2% for core goods, 28.2% for durables), and</w:t>
+        <w:t xml:space="preserve">is the total import content share for the relevant variant (32.1% for core goods, 28.0% for durables), and</w:t>
       </w:r>
       <w:r>
         <w:t xml:space="preserve"> </w:t>
@@ -2265,7 +2265,7 @@
           <w:i/>
           <w:iCs/>
         </w:rPr>
-        <w:t xml:space="preserve">Document generated on 2026-03-02 14:37:41.34494 using R R version 4.5.2 (2025-10-31 ucrt)</w:t>
+        <w:t xml:space="preserve">Document generated on 2026-03-18 10:34:58.096321 using R R version 4.5.2 (2025-10-31 ucrt)</w:t>
       </w:r>
     </w:p>
     <w:bookmarkEnd w:id="34"/>

</xml_diff>

<commit_message>
Publication run: regenerate website assets via new split pipeline
Website CSVs, Drupal HTML, and vintage snapshot all produced by
the new export_website_data.R and tariff_impacts_drupal.Rmd.

Co-Authored-By: Claude Opus 4.6 (1M context) <noreply@anthropic.com>
</commit_message>
<xml_diff>
--- a/output/publication/methodology.docx
+++ b/output/publication/methodology.docx
@@ -23,7 +23,7 @@
         <w:pStyle w:val="Date"/>
       </w:pPr>
       <w:r>
-        <w:t xml:space="preserve">March 18, 2026</w:t>
+        <w:t xml:space="preserve">March 20, 2026</w:t>
       </w:r>
     </w:p>
     <w:bookmarkStart w:id="21" w:name="introduction"/>
@@ -2265,7 +2265,7 @@
           <w:i/>
           <w:iCs/>
         </w:rPr>
-        <w:t xml:space="preserve">Document generated on 2026-03-18 10:34:58.096321 using R R version 4.5.2 (2025-10-31 ucrt)</w:t>
+        <w:t xml:space="preserve">Document generated on 2026-03-20 10:35:53.398089 using R R version 4.5.2 (2025-10-31 ucrt)</w:t>
       </w:r>
     </w:p>
     <w:bookmarkEnd w:id="34"/>

</xml_diff>

<commit_message>
Website CSV fixes and Drupal table consolidation
- F4/F6/FA2: add trend upper/lower bounds, null trend before Dec 2024
- F15: remove "(billions USD)" from column headers
- T1/TA1: fix header row format with ~~~Inputs~~~ grouping
- Consolidate T1a/T1b → T1, remove TA2 from embeds CSV
- Drupal: add dw-table-wide CSS class, wide param to dw_embed()
- Drupal: update text refs (Tables 1a-1b → Table 1, A1-A2 → A1)
- Regenerate publication outputs for 2026-03-21

Co-Authored-By: Claude Opus 4.6 (1M context) <noreply@anthropic.com>
</commit_message>
<xml_diff>
--- a/output/publication/methodology.docx
+++ b/output/publication/methodology.docx
@@ -23,7 +23,7 @@
         <w:pStyle w:val="Date"/>
       </w:pPr>
       <w:r>
-        <w:t xml:space="preserve">March 20, 2026</w:t>
+        <w:t xml:space="preserve">March 21, 2026</w:t>
       </w:r>
     </w:p>
     <w:bookmarkStart w:id="21" w:name="introduction"/>
@@ -2265,7 +2265,7 @@
           <w:i/>
           <w:iCs/>
         </w:rPr>
-        <w:t xml:space="preserve">Document generated on 2026-03-20 10:35:53.398089 using R R version 4.5.2 (2025-10-31 ucrt)</w:t>
+        <w:t xml:space="preserve">Document generated on 2026-03-21 11:34:40.208992 using R R version 4.5.2 (2025-10-31 ucrt)</w:t>
       </w:r>
     </w:p>
     <w:bookmarkEnd w:id="34"/>

</xml_diff>

<commit_message>
Report text updates: YoY growth, dollar formatting, passthrough framing
- Change intro PCE growth from YTD to year-over-year (core_yoy_change)
- Fix "January ." → "January 2026." (data_month_name → data_month)
- Add link to TBL Tariff Rate Tracker (GitHub repo)
- Fix \$246/\$319/\$165 rendering (remove backslash escapes)
- Fix $-number spacing: add dollar_fmt() helper, replace all $`r safe_fmt()`
- Add higher_lower() helper for dynamic LP vs log-linear comparison
- Replace cumulative imports paragraph with new stockpiling framing
- Revise passthrough discussion: distinguish border vs consumer passthrough,
  cite USITC Ch. 6 on margin compression, frame 100% as long-run expectation
- Publication run outputs included (Excel, CSVs, Drupal HTML, vintages)

Co-Authored-By: Claude Opus 4.6 (1M context) <noreply@anthropic.com>
</commit_message>
<xml_diff>
--- a/output/publication/methodology.docx
+++ b/output/publication/methodology.docx
@@ -23,7 +23,7 @@
         <w:pStyle w:val="Date"/>
       </w:pPr>
       <w:r>
-        <w:t xml:space="preserve">March 26, 2026</w:t>
+        <w:t xml:space="preserve">March 30, 2026</w:t>
       </w:r>
     </w:p>
     <w:bookmarkStart w:id="21" w:name="introduction"/>
@@ -2265,7 +2265,7 @@
           <w:i/>
           <w:iCs/>
         </w:rPr>
-        <w:t xml:space="preserve">Document generated on 2026-03-26 14:44:51.751479 using R R version 4.5.2 (2025-10-31 ucrt)</w:t>
+        <w:t xml:space="preserve">Document generated on 2026-03-30 16:59:06.545909 using R R version 4.5.2 (2025-10-31 ucrt)</w:t>
       </w:r>
     </w:p>
     <w:bookmarkEnd w:id="34"/>

</xml_diff>

<commit_message>
Publication run 2026-03-31: refresh outputs, add publication mode docs to README
Co-Authored-By: Claude Opus 4.6 (1M context) <noreply@anthropic.com>
</commit_message>
<xml_diff>
--- a/output/publication/methodology.docx
+++ b/output/publication/methodology.docx
@@ -23,7 +23,7 @@
         <w:pStyle w:val="Date"/>
       </w:pPr>
       <w:r>
-        <w:t xml:space="preserve">March 30, 2026</w:t>
+        <w:t xml:space="preserve">March 31, 2026</w:t>
       </w:r>
     </w:p>
     <w:bookmarkStart w:id="21" w:name="introduction"/>
@@ -2265,7 +2265,7 @@
           <w:i/>
           <w:iCs/>
         </w:rPr>
-        <w:t xml:space="preserve">Document generated on 2026-03-30 16:59:06.545909 using R R version 4.5.2 (2025-10-31 ucrt)</w:t>
+        <w:t xml:space="preserve">Document generated on 2026-03-31 12:09:01.188676 using R R version 4.5.2 (2025-10-31 ucrt)</w:t>
       </w:r>
     </w:p>
     <w:bookmarkEnd w:id="34"/>

</xml_diff>

<commit_message>
Fix fact-check issues and publication run 2026-04-01
Code fixes:
- Fix PG-3 comparison window: filter year==2024 (not 2023) for proper
  13-month analog of current PCE price window (report_setup.R)
- Fix IN-5 revenue date: use latest_rev_date instead of data_month so
  net revenue sentence correctly references February 2026

Text fixes (both report.Rmd and drupal.Rmd):
- KT-2: "SCOTUS decision repealing" → "Supreme Court decision vacating"
- TR-1: "statutory tariff rate" → "effective tariff rate"
- LM-4: Clarify comparison window wording
- LM-5: Specify "simple linear trend" to distinguish from LP trend in figure
- TD-1: Rewrite to show deviation change (4.2% → 22.0%, 17.8pp gap)

FX figures updated via re-knit with March 31 data (BIS NEER revision):
USD -7.6%, CNY -0.5% weaker, CAD +0.7%, MXN +13.4%

Co-Authored-By: Claude Opus 4.6 (1M context) <noreply@anthropic.com>
</commit_message>
<xml_diff>
--- a/output/publication/methodology.docx
+++ b/output/publication/methodology.docx
@@ -23,7 +23,7 @@
         <w:pStyle w:val="Date"/>
       </w:pPr>
       <w:r>
-        <w:t xml:space="preserve">March 31, 2026</w:t>
+        <w:t xml:space="preserve">April 01, 2026</w:t>
       </w:r>
     </w:p>
     <w:bookmarkStart w:id="21" w:name="introduction"/>
@@ -2265,7 +2265,7 @@
           <w:i/>
           <w:iCs/>
         </w:rPr>
-        <w:t xml:space="preserve">Document generated on 2026-03-31 13:08:28.611119 using R R version 4.5.2 (2025-10-31 ucrt)</w:t>
+        <w:t xml:space="preserve">Document generated on 2026-04-01 11:36:25.6314 using R R version 4.5.2 (2025-10-31 ucrt)</w:t>
       </w:r>
     </w:p>
     <w:bookmarkEnd w:id="34"/>

</xml_diff>